<commit_message>
docs(branding): manuais com identidade visual HW1 e prints reais do sistema
- Geradores atualizados: capa com hw1-gradient.webp, secao de capturas de tela
- Script capturar_screenshots.js: Playwright headless captura login, dashboard, portal e Swagger
- Screenshots reais incorporados (login 170KB, dashboard 293KB, portal 436KB, api_docs 102KB)
- Fallback automatico para placeholder caso screenshots ausentes
- MANUAL_COMPLETO_ARQUIVISTAS.docx: 1.157 KB (com prints reais)
- MANUAL_EXECUTIVO_TREINAMENTO_ARQUIVISTAS.docx: 733 KB (com prints reais)
</commit_message>
<xml_diff>
--- a/docs/MANUAL_COMPLETO_ARQUIVISTAS.docx
+++ b/docs/MANUAL_COMPLETO_ARQUIVISTAS.docx
@@ -3,6 +3,48 @@
 <w:document xmlns:wpc="http://schemas.microsoft.com/office/word/2010/wordprocessingCanvas" xmlns:mo="http://schemas.microsoft.com/office/mac/office/2008/main" xmlns:mc="http://schemas.openxmlformats.org/markup-compatibility/2006" xmlns:mv="urn:schemas-microsoft-com:mac:vml" xmlns:o="urn:schemas-microsoft-com:office:office" xmlns:r="http://schemas.openxmlformats.org/officeDocument/2006/relationships" xmlns:m="http://schemas.openxmlformats.org/officeDocument/2006/math" xmlns:v="urn:schemas-microsoft-com:vml" xmlns:wp14="http://schemas.microsoft.com/office/word/2010/wordprocessingDrawing" xmlns:wp="http://schemas.openxmlformats.org/drawingml/2006/wordprocessingDrawing" xmlns:w10="urn:schemas-microsoft-com:office:word" xmlns:w="http://schemas.openxmlformats.org/wordprocessingml/2006/main" xmlns:w14="http://schemas.microsoft.com/office/word/2010/wordml" xmlns:wpg="http://schemas.microsoft.com/office/word/2010/wordprocessingGroup" xmlns:wpi="http://schemas.microsoft.com/office/word/2010/wordprocessingInk" xmlns:wne="http://schemas.microsoft.com/office/word/2006/wordml" xmlns:wps="http://schemas.microsoft.com/office/word/2010/wordprocessingShape" mc:Ignorable="w14 wp14">
   <w:body>
     <w:p>
+      <w:pPr>
+        <w:jc w:val="center"/>
+      </w:pPr>
+      <w:r>
+        <w:drawing>
+          <wp:inline xmlns:a="http://schemas.openxmlformats.org/drawingml/2006/main" xmlns:pic="http://schemas.openxmlformats.org/drawingml/2006/picture">
+            <wp:extent cx="5669280" cy="2834640"/>
+            <wp:docPr id="1" name="Picture 1"/>
+            <wp:cNvGraphicFramePr>
+              <a:graphicFrameLocks noChangeAspect="1"/>
+            </wp:cNvGraphicFramePr>
+            <a:graphic>
+              <a:graphicData uri="http://schemas.openxmlformats.org/drawingml/2006/picture">
+                <pic:pic>
+                  <pic:nvPicPr>
+                    <pic:cNvPr id="0" name="hw1_gradient_pdjx5gmo.png"/>
+                    <pic:cNvPicPr/>
+                  </pic:nvPicPr>
+                  <pic:blipFill>
+                    <a:blip r:embed="rId9"/>
+                    <a:stretch>
+                      <a:fillRect/>
+                    </a:stretch>
+                  </pic:blipFill>
+                  <pic:spPr>
+                    <a:xfrm>
+                      <a:off x="0" y="0"/>
+                      <a:ext cx="5669280" cy="2834640"/>
+                    </a:xfrm>
+                    <a:prstGeom prst="rect"/>
+                  </pic:spPr>
+                </pic:pic>
+              </a:graphicData>
+            </a:graphic>
+          </wp:inline>
+        </w:drawing>
+      </w:r>
+    </w:p>
+    <w:p>
+      <w:pPr>
+        <w:jc w:val="center"/>
+      </w:pPr>
       <w:r>
         <w:rPr>
           <w:b/>
@@ -18,7 +60,7 @@
     </w:p>
     <w:p>
       <w:r>
-        <w:t>Gerado em: 22/03/2026 13:52</w:t>
+        <w:t>Gerado em: 22/03/2026 14:25</w:t>
       </w:r>
     </w:p>
     <w:p>
@@ -871,6 +913,195 @@
       </w:pPr>
       <w:r>
         <w:t>Emitir relatorios de apoio para controle gerencial.</w:t>
+      </w:r>
+    </w:p>
+    <w:p>
+      <w:pPr>
+        <w:pStyle w:val="Heading1"/>
+      </w:pPr>
+      <w:r>
+        <w:t>17. Capturas de Tela</w:t>
+      </w:r>
+    </w:p>
+    <w:p>
+      <w:r>
+        <w:t>Abaixo estao os prints do sistema para apoio de treinamento. Se algum print ainda nao existir, o documento inclui um placeholder visual para substituicao.</w:t>
+      </w:r>
+    </w:p>
+    <w:p>
+      <w:r>
+        <w:t>Tela de Login</w:t>
+      </w:r>
+    </w:p>
+    <w:p>
+      <w:pPr>
+        <w:jc w:val="center"/>
+      </w:pPr>
+      <w:r>
+        <w:drawing>
+          <wp:inline xmlns:a="http://schemas.openxmlformats.org/drawingml/2006/main" xmlns:pic="http://schemas.openxmlformats.org/drawingml/2006/picture">
+            <wp:extent cx="6126480" cy="3829050"/>
+            <wp:docPr id="2" name="Picture 2"/>
+            <wp:cNvGraphicFramePr>
+              <a:graphicFrameLocks noChangeAspect="1"/>
+            </wp:cNvGraphicFramePr>
+            <a:graphic>
+              <a:graphicData uri="http://schemas.openxmlformats.org/drawingml/2006/picture">
+                <pic:pic>
+                  <pic:nvPicPr>
+                    <pic:cNvPr id="0" name="login.png"/>
+                    <pic:cNvPicPr/>
+                  </pic:nvPicPr>
+                  <pic:blipFill>
+                    <a:blip r:embed="rId10"/>
+                    <a:stretch>
+                      <a:fillRect/>
+                    </a:stretch>
+                  </pic:blipFill>
+                  <pic:spPr>
+                    <a:xfrm>
+                      <a:off x="0" y="0"/>
+                      <a:ext cx="6126480" cy="3829050"/>
+                    </a:xfrm>
+                    <a:prstGeom prst="rect"/>
+                  </pic:spPr>
+                </pic:pic>
+              </a:graphicData>
+            </a:graphic>
+          </wp:inline>
+        </w:drawing>
+      </w:r>
+    </w:p>
+    <w:p>
+      <w:r>
+        <w:t>Portal do Cliente</w:t>
+      </w:r>
+    </w:p>
+    <w:p>
+      <w:pPr>
+        <w:jc w:val="center"/>
+      </w:pPr>
+      <w:r>
+        <w:drawing>
+          <wp:inline xmlns:a="http://schemas.openxmlformats.org/drawingml/2006/main" xmlns:pic="http://schemas.openxmlformats.org/drawingml/2006/picture">
+            <wp:extent cx="6126480" cy="3829050"/>
+            <wp:docPr id="3" name="Picture 3"/>
+            <wp:cNvGraphicFramePr>
+              <a:graphicFrameLocks noChangeAspect="1"/>
+            </wp:cNvGraphicFramePr>
+            <a:graphic>
+              <a:graphicData uri="http://schemas.openxmlformats.org/drawingml/2006/picture">
+                <pic:pic>
+                  <pic:nvPicPr>
+                    <pic:cNvPr id="0" name="portal.png"/>
+                    <pic:cNvPicPr/>
+                  </pic:nvPicPr>
+                  <pic:blipFill>
+                    <a:blip r:embed="rId11"/>
+                    <a:stretch>
+                      <a:fillRect/>
+                    </a:stretch>
+                  </pic:blipFill>
+                  <pic:spPr>
+                    <a:xfrm>
+                      <a:off x="0" y="0"/>
+                      <a:ext cx="6126480" cy="3829050"/>
+                    </a:xfrm>
+                    <a:prstGeom prst="rect"/>
+                  </pic:spPr>
+                </pic:pic>
+              </a:graphicData>
+            </a:graphic>
+          </wp:inline>
+        </w:drawing>
+      </w:r>
+    </w:p>
+    <w:p>
+      <w:r>
+        <w:t>Dashboard Administrativo</w:t>
+      </w:r>
+    </w:p>
+    <w:p>
+      <w:pPr>
+        <w:jc w:val="center"/>
+      </w:pPr>
+      <w:r>
+        <w:drawing>
+          <wp:inline xmlns:a="http://schemas.openxmlformats.org/drawingml/2006/main" xmlns:pic="http://schemas.openxmlformats.org/drawingml/2006/picture">
+            <wp:extent cx="6126480" cy="3829050"/>
+            <wp:docPr id="4" name="Picture 4"/>
+            <wp:cNvGraphicFramePr>
+              <a:graphicFrameLocks noChangeAspect="1"/>
+            </wp:cNvGraphicFramePr>
+            <a:graphic>
+              <a:graphicData uri="http://schemas.openxmlformats.org/drawingml/2006/picture">
+                <pic:pic>
+                  <pic:nvPicPr>
+                    <pic:cNvPr id="0" name="dashboard.png"/>
+                    <pic:cNvPicPr/>
+                  </pic:nvPicPr>
+                  <pic:blipFill>
+                    <a:blip r:embed="rId12"/>
+                    <a:stretch>
+                      <a:fillRect/>
+                    </a:stretch>
+                  </pic:blipFill>
+                  <pic:spPr>
+                    <a:xfrm>
+                      <a:off x="0" y="0"/>
+                      <a:ext cx="6126480" cy="3829050"/>
+                    </a:xfrm>
+                    <a:prstGeom prst="rect"/>
+                  </pic:spPr>
+                </pic:pic>
+              </a:graphicData>
+            </a:graphic>
+          </wp:inline>
+        </w:drawing>
+      </w:r>
+    </w:p>
+    <w:p>
+      <w:r>
+        <w:t>Swagger / Documentacao da API</w:t>
+      </w:r>
+    </w:p>
+    <w:p>
+      <w:pPr>
+        <w:jc w:val="center"/>
+      </w:pPr>
+      <w:r>
+        <w:drawing>
+          <wp:inline xmlns:a="http://schemas.openxmlformats.org/drawingml/2006/main" xmlns:pic="http://schemas.openxmlformats.org/drawingml/2006/picture">
+            <wp:extent cx="6126480" cy="3829050"/>
+            <wp:docPr id="5" name="Picture 5"/>
+            <wp:cNvGraphicFramePr>
+              <a:graphicFrameLocks noChangeAspect="1"/>
+            </wp:cNvGraphicFramePr>
+            <a:graphic>
+              <a:graphicData uri="http://schemas.openxmlformats.org/drawingml/2006/picture">
+                <pic:pic>
+                  <pic:nvPicPr>
+                    <pic:cNvPr id="0" name="api_docs.png"/>
+                    <pic:cNvPicPr/>
+                  </pic:nvPicPr>
+                  <pic:blipFill>
+                    <a:blip r:embed="rId13"/>
+                    <a:stretch>
+                      <a:fillRect/>
+                    </a:stretch>
+                  </pic:blipFill>
+                  <pic:spPr>
+                    <a:xfrm>
+                      <a:off x="0" y="0"/>
+                      <a:ext cx="6126480" cy="3829050"/>
+                    </a:xfrm>
+                    <a:prstGeom prst="rect"/>
+                  </pic:spPr>
+                </pic:pic>
+              </a:graphicData>
+            </a:graphic>
+          </wp:inline>
+        </w:drawing>
       </w:r>
     </w:p>
     <w:sectPr>

</xml_diff>